<commit_message>
Identity, domain models, and migrations
</commit_message>
<xml_diff>
--- a/Documentation.docx
+++ b/Documentation.docx
@@ -318,9 +318,9 @@
         <w:tblLook w:val="04A0" w:firstRow="1" w:lastRow="0" w:firstColumn="1" w:lastColumn="0" w:noHBand="0" w:noVBand="1"/>
       </w:tblPr>
       <w:tblGrid>
-        <w:gridCol w:w="3146"/>
-        <w:gridCol w:w="3147"/>
-        <w:gridCol w:w="3147"/>
+        <w:gridCol w:w="2610"/>
+        <w:gridCol w:w="3870"/>
+        <w:gridCol w:w="2960"/>
       </w:tblGrid>
       <w:tr>
         <w:trPr>
@@ -330,7 +330,7 @@
         <w:tc>
           <w:tcPr>
             <w:cnfStyle w:val="001000000000" w:firstRow="0" w:lastRow="0" w:firstColumn="1" w:lastColumn="0" w:oddVBand="0" w:evenVBand="0" w:oddHBand="0" w:evenHBand="0" w:firstRowFirstColumn="0" w:firstRowLastColumn="0" w:lastRowFirstColumn="0" w:lastRowLastColumn="0"/>
-            <w:tcW w:w="3146" w:type="dxa"/>
+            <w:tcW w:w="2610" w:type="dxa"/>
           </w:tcPr>
           <w:p>
             <w:pPr>
@@ -349,7 +349,7 @@
         </w:tc>
         <w:tc>
           <w:tcPr>
-            <w:tcW w:w="3147" w:type="dxa"/>
+            <w:tcW w:w="3870" w:type="dxa"/>
           </w:tcPr>
           <w:p>
             <w:pPr>
@@ -368,7 +368,7 @@
         </w:tc>
         <w:tc>
           <w:tcPr>
-            <w:tcW w:w="3147" w:type="dxa"/>
+            <w:tcW w:w="2960" w:type="dxa"/>
           </w:tcPr>
           <w:p>
             <w:pPr>
@@ -394,7 +394,7 @@
         <w:tc>
           <w:tcPr>
             <w:cnfStyle w:val="001000000000" w:firstRow="0" w:lastRow="0" w:firstColumn="1" w:lastColumn="0" w:oddVBand="0" w:evenVBand="0" w:oddHBand="0" w:evenHBand="0" w:firstRowFirstColumn="0" w:firstRowLastColumn="0" w:lastRowFirstColumn="0" w:lastRowLastColumn="0"/>
-            <w:tcW w:w="3146" w:type="dxa"/>
+            <w:tcW w:w="2610" w:type="dxa"/>
           </w:tcPr>
           <w:p>
             <w:pPr>
@@ -414,30 +414,77 @@
         </w:tc>
         <w:tc>
           <w:tcPr>
-            <w:tcW w:w="3147" w:type="dxa"/>
+            <w:tcW w:w="3870" w:type="dxa"/>
           </w:tcPr>
           <w:p>
             <w:pPr>
               <w:cnfStyle w:val="000000100000" w:firstRow="0" w:lastRow="0" w:firstColumn="0" w:lastColumn="0" w:oddVBand="0" w:evenVBand="0" w:oddHBand="1" w:evenHBand="0" w:firstRowFirstColumn="0" w:firstRowLastColumn="0" w:lastRowFirstColumn="0" w:lastRowLastColumn="0"/>
             </w:pPr>
             <w:r>
-              <w:t>Team Lead /</w:t>
+              <w:t>Team Lead</w:t>
             </w:r>
             <w:r>
-              <w:t xml:space="preserve"> ---</w:t>
+              <w:br/>
+            </w:r>
+            <w:r>
+              <w:t>Accounts Payable</w:t>
+            </w:r>
+            <w:r>
+              <w:br/>
+            </w:r>
+            <w:r>
+              <w:t>Authorization</w:t>
             </w:r>
           </w:p>
         </w:tc>
         <w:tc>
           <w:tcPr>
-            <w:tcW w:w="3147" w:type="dxa"/>
+            <w:tcW w:w="2960" w:type="dxa"/>
           </w:tcPr>
           <w:p>
             <w:pPr>
               <w:cnfStyle w:val="000000100000" w:firstRow="0" w:lastRow="0" w:firstColumn="0" w:lastColumn="0" w:oddVBand="0" w:evenVBand="0" w:oddHBand="1" w:evenHBand="0" w:firstRowFirstColumn="0" w:firstRowLastColumn="0" w:lastRowFirstColumn="0" w:lastRowLastColumn="0"/>
             </w:pPr>
             <w:r>
-              <w:t>---</w:t>
+              <w:t xml:space="preserve">Accounts </w:t>
+            </w:r>
+            <w:proofErr w:type="gramStart"/>
+            <w:r>
+              <w:t>Payable</w:t>
+            </w:r>
+            <w:r>
+              <w:t xml:space="preserve"> </w:t>
+            </w:r>
+            <w:r>
+              <w:t xml:space="preserve"> module</w:t>
+            </w:r>
+            <w:proofErr w:type="gramEnd"/>
+            <w:r>
+              <w:br/>
+              <w:t>(</w:t>
+            </w:r>
+            <w:proofErr w:type="gramStart"/>
+            <w:r>
+              <w:t>Bills ,Vendor</w:t>
+            </w:r>
+            <w:proofErr w:type="gramEnd"/>
+            <w:r>
+              <w:t>, Bill Payment) /</w:t>
+            </w:r>
+            <w:r>
+              <w:t xml:space="preserve"> </w:t>
+            </w:r>
+            <w:r>
+              <w:br/>
+            </w:r>
+            <w:r>
+              <w:t>Users List</w:t>
+            </w:r>
+            <w:r>
+              <w:br/>
+            </w:r>
+            <w:r>
+              <w:t>User Form</w:t>
             </w:r>
           </w:p>
         </w:tc>
@@ -449,7 +496,7 @@
         <w:tc>
           <w:tcPr>
             <w:cnfStyle w:val="001000000000" w:firstRow="0" w:lastRow="0" w:firstColumn="1" w:lastColumn="0" w:oddVBand="0" w:evenVBand="0" w:oddHBand="0" w:evenHBand="0" w:firstRowFirstColumn="0" w:firstRowLastColumn="0" w:lastRowFirstColumn="0" w:lastRowLastColumn="0"/>
-            <w:tcW w:w="3146" w:type="dxa"/>
+            <w:tcW w:w="2610" w:type="dxa"/>
           </w:tcPr>
           <w:p>
             <w:pPr>
@@ -469,30 +516,59 @@
         </w:tc>
         <w:tc>
           <w:tcPr>
-            <w:tcW w:w="3147" w:type="dxa"/>
+            <w:tcW w:w="3870" w:type="dxa"/>
+          </w:tcPr>
+          <w:p>
+            <w:pPr>
+              <w:cnfStyle w:val="000000000000" w:firstRow="0" w:lastRow="0" w:firstColumn="0" w:lastColumn="0" w:oddVBand="0" w:evenVBand="0" w:oddHBand="0" w:evenHBand="0" w:firstRowFirstColumn="0" w:firstRowLastColumn="0" w:lastRowFirstColumn="0" w:lastRowLastColumn="0"/>
+              <w:rPr>
+                <w:b/>
+                <w:bCs/>
+              </w:rPr>
+            </w:pPr>
+            <w:r>
+              <w:t>Authentication</w:t>
+            </w:r>
+            <w:r>
+              <w:br/>
+            </w:r>
+            <w:r>
+              <w:t>Entities</w:t>
+            </w:r>
+            <w:r>
+              <w:t>/Tables</w:t>
+            </w:r>
+            <w:r>
+              <w:br/>
+            </w:r>
+            <w:r>
+              <w:t>Chart of Accounts, Dashboard</w:t>
+            </w:r>
+          </w:p>
+        </w:tc>
+        <w:tc>
+          <w:tcPr>
+            <w:tcW w:w="2960" w:type="dxa"/>
           </w:tcPr>
           <w:p>
             <w:pPr>
               <w:cnfStyle w:val="000000000000" w:firstRow="0" w:lastRow="0" w:firstColumn="0" w:lastColumn="0" w:oddVBand="0" w:evenVBand="0" w:oddHBand="0" w:evenHBand="0" w:firstRowFirstColumn="0" w:firstRowLastColumn="0" w:lastRowFirstColumn="0" w:lastRowLastColumn="0"/>
             </w:pPr>
             <w:r>
-              <w:t>---</w:t>
-            </w:r>
-          </w:p>
-        </w:tc>
-        <w:tc>
-          <w:tcPr>
-            <w:tcW w:w="3147" w:type="dxa"/>
-          </w:tcPr>
-          <w:p>
-            <w:pPr>
-              <w:cnfStyle w:val="000000000000" w:firstRow="0" w:lastRow="0" w:firstColumn="0" w:lastColumn="0" w:oddVBand="0" w:evenVBand="0" w:oddHBand="0" w:evenHBand="0" w:firstRowFirstColumn="0" w:firstRowLastColumn="0" w:lastRowFirstColumn="0" w:lastRowLastColumn="0"/>
-            </w:pPr>
-            <w:r>
-              <w:t xml:space="preserve">--- / </w:t>
+              <w:t>N</w:t>
             </w:r>
             <w:r>
-              <w:t>ERD Diagram</w:t>
+              <w:noBreakHyphen/>
+              <w:t>Tier setu</w:t>
+            </w:r>
+            <w:r>
+              <w:t>p /E</w:t>
+            </w:r>
+            <w:r>
+              <w:t>ntities Design</w:t>
+            </w:r>
+            <w:r>
+              <w:t xml:space="preserve"> </w:t>
             </w:r>
             <w:r>
               <w:t xml:space="preserve">/ </w:t>
@@ -511,7 +587,7 @@
         <w:tc>
           <w:tcPr>
             <w:cnfStyle w:val="001000000000" w:firstRow="0" w:lastRow="0" w:firstColumn="1" w:lastColumn="0" w:oddVBand="0" w:evenVBand="0" w:oddHBand="0" w:evenHBand="0" w:firstRowFirstColumn="0" w:firstRowLastColumn="0" w:lastRowFirstColumn="0" w:lastRowLastColumn="0"/>
-            <w:tcW w:w="3146" w:type="dxa"/>
+            <w:tcW w:w="2610" w:type="dxa"/>
           </w:tcPr>
           <w:p>
             <w:pPr>
@@ -531,7 +607,7 @@
         </w:tc>
         <w:tc>
           <w:tcPr>
-            <w:tcW w:w="3147" w:type="dxa"/>
+            <w:tcW w:w="3870" w:type="dxa"/>
           </w:tcPr>
           <w:p>
             <w:pPr>
@@ -544,7 +620,7 @@
         </w:tc>
         <w:tc>
           <w:tcPr>
-            <w:tcW w:w="3147" w:type="dxa"/>
+            <w:tcW w:w="2960" w:type="dxa"/>
           </w:tcPr>
           <w:p>
             <w:pPr>
@@ -563,7 +639,7 @@
         <w:tc>
           <w:tcPr>
             <w:cnfStyle w:val="001000000000" w:firstRow="0" w:lastRow="0" w:firstColumn="1" w:lastColumn="0" w:oddVBand="0" w:evenVBand="0" w:oddHBand="0" w:evenHBand="0" w:firstRowFirstColumn="0" w:firstRowLastColumn="0" w:lastRowFirstColumn="0" w:lastRowLastColumn="0"/>
-            <w:tcW w:w="3146" w:type="dxa"/>
+            <w:tcW w:w="2610" w:type="dxa"/>
           </w:tcPr>
           <w:p>
             <w:pPr>
@@ -583,7 +659,7 @@
         </w:tc>
         <w:tc>
           <w:tcPr>
-            <w:tcW w:w="3147" w:type="dxa"/>
+            <w:tcW w:w="3870" w:type="dxa"/>
           </w:tcPr>
           <w:p>
             <w:pPr>
@@ -596,7 +672,7 @@
         </w:tc>
         <w:tc>
           <w:tcPr>
-            <w:tcW w:w="3147" w:type="dxa"/>
+            <w:tcW w:w="2960" w:type="dxa"/>
           </w:tcPr>
           <w:p>
             <w:pPr>
@@ -616,7 +692,7 @@
         <w:tc>
           <w:tcPr>
             <w:cnfStyle w:val="001000000000" w:firstRow="0" w:lastRow="0" w:firstColumn="1" w:lastColumn="0" w:oddVBand="0" w:evenVBand="0" w:oddHBand="0" w:evenHBand="0" w:firstRowFirstColumn="0" w:firstRowLastColumn="0" w:lastRowFirstColumn="0" w:lastRowLastColumn="0"/>
-            <w:tcW w:w="3146" w:type="dxa"/>
+            <w:tcW w:w="2610" w:type="dxa"/>
           </w:tcPr>
           <w:p>
             <w:pPr>
@@ -636,7 +712,7 @@
         </w:tc>
         <w:tc>
           <w:tcPr>
-            <w:tcW w:w="3147" w:type="dxa"/>
+            <w:tcW w:w="3870" w:type="dxa"/>
           </w:tcPr>
           <w:p>
             <w:pPr>
@@ -649,7 +725,7 @@
         </w:tc>
         <w:tc>
           <w:tcPr>
-            <w:tcW w:w="3147" w:type="dxa"/>
+            <w:tcW w:w="2960" w:type="dxa"/>
           </w:tcPr>
           <w:p>
             <w:pPr>
@@ -2025,6 +2101,15 @@
           <w:szCs w:val="24"/>
         </w:rPr>
         <w:t>6. Use Cases</w:t>
+      </w:r>
+      <w:r>
+        <w:rPr>
+          <w:b/>
+          <w:bCs/>
+          <w:sz w:val="24"/>
+          <w:szCs w:val="24"/>
+        </w:rPr>
+        <w:t xml:space="preserve"> Ex</w:t>
       </w:r>
     </w:p>
     <w:tbl>
@@ -2493,21 +2578,21 @@
           <w:noProof/>
         </w:rPr>
         <w:drawing>
-          <wp:anchor distT="0" distB="0" distL="114300" distR="114300" simplePos="0" relativeHeight="251664384" behindDoc="1" locked="0" layoutInCell="1" allowOverlap="1" wp14:anchorId="60287E42" wp14:editId="571101CB">
+          <wp:anchor distT="0" distB="0" distL="114300" distR="114300" simplePos="0" relativeHeight="251664384" behindDoc="1" locked="0" layoutInCell="1" allowOverlap="1" wp14:anchorId="60287E42" wp14:editId="270100DC">
             <wp:simplePos x="0" y="0"/>
             <wp:positionH relativeFrom="column">
-              <wp:posOffset>-723910</wp:posOffset>
+              <wp:posOffset>-723900</wp:posOffset>
             </wp:positionH>
             <wp:positionV relativeFrom="paragraph">
-              <wp:posOffset>340635</wp:posOffset>
+              <wp:posOffset>466725</wp:posOffset>
             </wp:positionV>
-            <wp:extent cx="7360285" cy="7546975"/>
+            <wp:extent cx="7360285" cy="3943985"/>
             <wp:effectExtent l="0" t="0" r="0" b="0"/>
             <wp:wrapTight wrapText="bothSides">
               <wp:wrapPolygon edited="0">
                 <wp:start x="0" y="0"/>
-                <wp:lineTo x="0" y="21536"/>
-                <wp:lineTo x="21524" y="21536"/>
+                <wp:lineTo x="0" y="21492"/>
+                <wp:lineTo x="21524" y="21492"/>
                 <wp:lineTo x="21524" y="0"/>
                 <wp:lineTo x="0" y="0"/>
               </wp:wrapPolygon>
@@ -2520,20 +2605,13 @@
               <a:graphicData uri="http://schemas.openxmlformats.org/drawingml/2006/picture">
                 <pic:pic xmlns:pic="http://schemas.openxmlformats.org/drawingml/2006/picture">
                   <pic:nvPicPr>
-                    <pic:cNvPr id="0" name="Picture 9"/>
+                    <pic:cNvPr id="1311361207" name="Picture 5"/>
                     <pic:cNvPicPr>
                       <a:picLocks noChangeAspect="1" noChangeArrowheads="1"/>
                     </pic:cNvPicPr>
                   </pic:nvPicPr>
                   <pic:blipFill>
-                    <a:blip r:embed="rId16">
-                      <a:extLst>
-                        <a:ext uri="{28A0092B-C50C-407E-A947-70E740481C1C}">
-                          <a14:useLocalDpi xmlns:a14="http://schemas.microsoft.com/office/drawing/2010/main" val="0"/>
-                        </a:ext>
-                      </a:extLst>
-                    </a:blip>
-                    <a:srcRect/>
+                    <a:blip r:embed="rId16"/>
                     <a:stretch>
                       <a:fillRect/>
                     </a:stretch>
@@ -2541,7 +2619,7 @@
                   <pic:spPr bwMode="auto">
                     <a:xfrm>
                       <a:off x="0" y="0"/>
-                      <a:ext cx="7360285" cy="7546975"/>
+                      <a:ext cx="7360285" cy="3943985"/>
                     </a:xfrm>
                     <a:prstGeom prst="rect">
                       <a:avLst/>
@@ -2596,7 +2674,115 @@
           <w:sz w:val="28"/>
           <w:szCs w:val="28"/>
         </w:rPr>
+        <w:br/>
+      </w:r>
+      <w:r>
+        <w:rPr>
+          <w:b/>
+          <w:bCs/>
+          <w:sz w:val="28"/>
+          <w:szCs w:val="28"/>
+        </w:rPr>
+        <w:br/>
+      </w:r>
+      <w:r>
+        <w:rPr>
+          <w:b/>
+          <w:bCs/>
+          <w:sz w:val="28"/>
+          <w:szCs w:val="28"/>
+        </w:rPr>
+        <w:br/>
+      </w:r>
+      <w:r>
+        <w:rPr>
+          <w:b/>
+          <w:bCs/>
+          <w:sz w:val="28"/>
+          <w:szCs w:val="28"/>
+        </w:rPr>
+        <w:br/>
+      </w:r>
+      <w:r>
+        <w:rPr>
+          <w:b/>
+          <w:bCs/>
+          <w:sz w:val="28"/>
+          <w:szCs w:val="28"/>
+        </w:rPr>
+        <w:br/>
+      </w:r>
+      <w:r>
+        <w:rPr>
+          <w:b/>
+          <w:bCs/>
+          <w:sz w:val="28"/>
+          <w:szCs w:val="28"/>
+        </w:rPr>
+        <w:br/>
+      </w:r>
+      <w:r>
+        <w:rPr>
+          <w:b/>
+          <w:bCs/>
+          <w:sz w:val="28"/>
+          <w:szCs w:val="28"/>
+        </w:rPr>
+        <w:br/>
+      </w:r>
+      <w:r>
+        <w:rPr>
+          <w:b/>
+          <w:bCs/>
+          <w:sz w:val="28"/>
+          <w:szCs w:val="28"/>
+        </w:rPr>
+        <w:br/>
+      </w:r>
+      <w:r>
+        <w:rPr>
+          <w:b/>
+          <w:bCs/>
+          <w:sz w:val="28"/>
+          <w:szCs w:val="28"/>
+        </w:rPr>
+        <w:br/>
+      </w:r>
+      <w:r>
+        <w:rPr>
+          <w:b/>
+          <w:bCs/>
+          <w:sz w:val="28"/>
+          <w:szCs w:val="28"/>
+        </w:rPr>
+        <w:br/>
+      </w:r>
+      <w:r>
+        <w:rPr>
+          <w:b/>
+          <w:bCs/>
+          <w:sz w:val="28"/>
+          <w:szCs w:val="28"/>
+        </w:rPr>
+        <w:br/>
+      </w:r>
+      <w:r>
+        <w:rPr>
+          <w:b/>
+          <w:bCs/>
+          <w:sz w:val="28"/>
+          <w:szCs w:val="28"/>
+        </w:rPr>
         <w:lastRenderedPageBreak/>
+        <w:br/>
+      </w:r>
+      <w:r>
+        <w:rPr>
+          <w:b/>
+          <w:bCs/>
+          <w:sz w:val="28"/>
+          <w:szCs w:val="28"/>
+        </w:rPr>
         <w:t>Architecture &amp; Design Patterns (Page ...)</w:t>
       </w:r>
     </w:p>
@@ -2835,40 +3021,6 @@
           <w:bCs/>
         </w:rPr>
         <w:t>Design Patterns Used</w:t>
-      </w:r>
-    </w:p>
-    <w:p>
-      <w:pPr>
-        <w:numPr>
-          <w:ilvl w:val="0"/>
-          <w:numId w:val="44"/>
-        </w:numPr>
-      </w:pPr>
-      <w:r>
-        <w:rPr>
-          <w:b/>
-          <w:bCs/>
-        </w:rPr>
-        <w:t>Repository Pattern:</w:t>
-      </w:r>
-      <w:r>
-        <w:t> Abstracts CRUD operations. For example, </w:t>
-      </w:r>
-      <w:proofErr w:type="spellStart"/>
-      <w:r>
-        <w:t>IJournalEntryRepository.GetLedger</w:t>
-      </w:r>
-      <w:proofErr w:type="spellEnd"/>
-      <w:r>
-        <w:t>(</w:t>
-      </w:r>
-      <w:proofErr w:type="spellStart"/>
-      <w:r>
-        <w:t>accountId</w:t>
-      </w:r>
-      <w:proofErr w:type="spellEnd"/>
-      <w:r>
-        <w:t>) hides complex SQL joins behind a simple method call.</w:t>
       </w:r>
     </w:p>
     <w:p>
@@ -3039,6 +3191,9 @@
       </w:hyperlink>
       <w:r>
         <w:t> Core Identity</w:t>
+      </w:r>
+      <w:r>
+        <w:br/>
       </w:r>
     </w:p>
     <w:p>
@@ -3655,16 +3810,7 @@
           <w:sz w:val="24"/>
           <w:szCs w:val="24"/>
         </w:rPr>
-        <w:t>The Digital Egypt Builders Initiative</w:t>
-      </w:r>
-      <w:r>
-        <w:rPr>
-          <w:b/>
-          <w:bCs/>
-          <w:sz w:val="24"/>
-          <w:szCs w:val="24"/>
-        </w:rPr>
-        <w:t xml:space="preserve"> </w:t>
+        <w:t xml:space="preserve">The Digital Egypt Builders Initiative </w:t>
       </w:r>
       <w:r>
         <w:rPr>
@@ -32446,15 +32592,29 @@
 </file>
 
 <file path=customXml/item1.xml><?xml version="1.0" encoding="utf-8"?>
-<?mso-contentType ?>
-<FormTemplates xmlns="http://schemas.microsoft.com/sharepoint/v3/contenttype/forms">
-  <Display>DocumentLibraryForm</Display>
-  <Edit>DocumentLibraryForm</Edit>
-  <New>DocumentLibraryForm</New>
-</FormTemplates>
+<b:Sources xmlns:b="http://schemas.openxmlformats.org/officeDocument/2006/bibliography" xmlns="http://schemas.openxmlformats.org/officeDocument/2006/bibliography" SelectedStyle="\APASixthEditionOfficeOnline.xsl" StyleName="APA" Version="6"/>
 </file>
 
 <file path=customXml/item2.xml><?xml version="1.0" encoding="utf-8"?>
+<p:properties xmlns:p="http://schemas.microsoft.com/office/2006/metadata/properties" xmlns:xsi="http://www.w3.org/2001/XMLSchema-instance" xmlns:pc="http://schemas.microsoft.com/office/infopath/2007/PartnerControls">
+  <documentManagement>
+    <_ip_UnifiedCompliancePolicyUIAction xmlns="http://schemas.microsoft.com/sharepoint/v3" xsi:nil="true"/>
+    <Image xmlns="71af3243-3dd4-4a8d-8c0d-dd76da1f02a5">
+      <Url xsi:nil="true"/>
+      <Description xsi:nil="true"/>
+    </Image>
+    <Status xmlns="71af3243-3dd4-4a8d-8c0d-dd76da1f02a5">Not started</Status>
+    <_ip_UnifiedCompliancePolicyProperties xmlns="http://schemas.microsoft.com/sharepoint/v3" xsi:nil="true"/>
+    <ImageTagsTaxHTField xmlns="71af3243-3dd4-4a8d-8c0d-dd76da1f02a5">
+      <Terms xmlns="http://schemas.microsoft.com/office/infopath/2007/PartnerControls"/>
+    </ImageTagsTaxHTField>
+    <TaxCatchAll xmlns="230e9df3-be65-4c73-a93b-d1236ebd677e"/>
+    <MediaServiceKeyPoints xmlns="71af3243-3dd4-4a8d-8c0d-dd76da1f02a5" xsi:nil="true"/>
+  </documentManagement>
+</p:properties>
+</file>
+
+<file path=customXml/item3.xml><?xml version="1.0" encoding="utf-8"?>
 <ct:contentTypeSchema xmlns:ct="http://schemas.microsoft.com/office/2006/metadata/contentType" xmlns:ma="http://schemas.microsoft.com/office/2006/metadata/properties/metaAttributes" ct:_="" ma:_="" ma:contentTypeName="Document" ma:contentTypeID="0x01010079F111ED35F8CC479449609E8A0923A6" ma:contentTypeVersion="20" ma:contentTypeDescription="Create a new document." ma:contentTypeScope="" ma:versionID="1267097ee5f5874adfcc408041ae252e">
   <xsd:schema xmlns:xsd="http://www.w3.org/2001/XMLSchema" xmlns:xs="http://www.w3.org/2001/XMLSchema" xmlns:p="http://schemas.microsoft.com/office/2006/metadata/properties" xmlns:ns1="http://schemas.microsoft.com/sharepoint/v3" xmlns:ns2="71af3243-3dd4-4a8d-8c0d-dd76da1f02a5" xmlns:ns3="16c05727-aa75-4e4a-9b5f-8a80a1165891" xmlns:ns4="230e9df3-be65-4c73-a93b-d1236ebd677e" targetNamespace="http://schemas.microsoft.com/office/2006/metadata/properties" ma:root="true" ma:fieldsID="395891a93df65b14727750f2c06c306c" ns1:_="" ns2:_="" ns3:_="" ns4:_="">
     <xsd:import namespace="http://schemas.microsoft.com/sharepoint/v3"/>
@@ -32730,38 +32890,36 @@
 </ct:contentTypeSchema>
 </file>
 
-<file path=customXml/item3.xml><?xml version="1.0" encoding="utf-8"?>
-<p:properties xmlns:p="http://schemas.microsoft.com/office/2006/metadata/properties" xmlns:xsi="http://www.w3.org/2001/XMLSchema-instance" xmlns:pc="http://schemas.microsoft.com/office/infopath/2007/PartnerControls">
-  <documentManagement>
-    <_ip_UnifiedCompliancePolicyUIAction xmlns="http://schemas.microsoft.com/sharepoint/v3" xsi:nil="true"/>
-    <Image xmlns="71af3243-3dd4-4a8d-8c0d-dd76da1f02a5">
-      <Url xsi:nil="true"/>
-      <Description xsi:nil="true"/>
-    </Image>
-    <Status xmlns="71af3243-3dd4-4a8d-8c0d-dd76da1f02a5">Not started</Status>
-    <_ip_UnifiedCompliancePolicyProperties xmlns="http://schemas.microsoft.com/sharepoint/v3" xsi:nil="true"/>
-    <ImageTagsTaxHTField xmlns="71af3243-3dd4-4a8d-8c0d-dd76da1f02a5">
-      <Terms xmlns="http://schemas.microsoft.com/office/infopath/2007/PartnerControls"/>
-    </ImageTagsTaxHTField>
-    <TaxCatchAll xmlns="230e9df3-be65-4c73-a93b-d1236ebd677e"/>
-    <MediaServiceKeyPoints xmlns="71af3243-3dd4-4a8d-8c0d-dd76da1f02a5" xsi:nil="true"/>
-  </documentManagement>
-</p:properties>
-</file>
-
 <file path=customXml/item4.xml><?xml version="1.0" encoding="utf-8"?>
-<b:Sources xmlns:b="http://schemas.openxmlformats.org/officeDocument/2006/bibliography" xmlns="http://schemas.openxmlformats.org/officeDocument/2006/bibliography" SelectedStyle="\APASixthEditionOfficeOnline.xsl" StyleName="APA" Version="6"/>
+<?mso-contentType ?>
+<FormTemplates xmlns="http://schemas.microsoft.com/sharepoint/v3/contenttype/forms">
+  <Display>DocumentLibraryForm</Display>
+  <Edit>DocumentLibraryForm</Edit>
+  <New>DocumentLibraryForm</New>
+</FormTemplates>
 </file>
 
 <file path=customXml/itemProps1.xml><?xml version="1.0" encoding="utf-8"?>
-<ds:datastoreItem xmlns:ds="http://schemas.openxmlformats.org/officeDocument/2006/customXml" ds:itemID="{878A3276-187E-405F-966A-BDA24FF7DCFF}">
+<ds:datastoreItem xmlns:ds="http://schemas.openxmlformats.org/officeDocument/2006/customXml" ds:itemID="{9EAA2E9E-4E47-497B-A79A-B397382D8E2F}">
   <ds:schemaRefs>
-    <ds:schemaRef ds:uri="http://schemas.microsoft.com/sharepoint/v3/contenttype/forms"/>
+    <ds:schemaRef ds:uri="http://schemas.openxmlformats.org/officeDocument/2006/bibliography"/>
   </ds:schemaRefs>
 </ds:datastoreItem>
 </file>
 
 <file path=customXml/itemProps2.xml><?xml version="1.0" encoding="utf-8"?>
+<ds:datastoreItem xmlns:ds="http://schemas.openxmlformats.org/officeDocument/2006/customXml" ds:itemID="{91E7373D-5DCA-4092-912F-7D030B4FE61E}">
+  <ds:schemaRefs>
+    <ds:schemaRef ds:uri="http://schemas.microsoft.com/office/2006/metadata/properties"/>
+    <ds:schemaRef ds:uri="http://schemas.microsoft.com/office/infopath/2007/PartnerControls"/>
+    <ds:schemaRef ds:uri="http://schemas.microsoft.com/sharepoint/v3"/>
+    <ds:schemaRef ds:uri="71af3243-3dd4-4a8d-8c0d-dd76da1f02a5"/>
+    <ds:schemaRef ds:uri="230e9df3-be65-4c73-a93b-d1236ebd677e"/>
+  </ds:schemaRefs>
+</ds:datastoreItem>
+</file>
+
+<file path=customXml/itemProps3.xml><?xml version="1.0" encoding="utf-8"?>
 <ds:datastoreItem xmlns:ds="http://schemas.openxmlformats.org/officeDocument/2006/customXml" ds:itemID="{B15B1B51-5121-472B-BA9E-DC61343F5AF6}">
   <ds:schemaRefs>
     <ds:schemaRef ds:uri="http://schemas.microsoft.com/office/2006/metadata/contentType"/>
@@ -32782,22 +32940,10 @@
 </ds:datastoreItem>
 </file>
 
-<file path=customXml/itemProps3.xml><?xml version="1.0" encoding="utf-8"?>
-<ds:datastoreItem xmlns:ds="http://schemas.openxmlformats.org/officeDocument/2006/customXml" ds:itemID="{91E7373D-5DCA-4092-912F-7D030B4FE61E}">
+<file path=customXml/itemProps4.xml><?xml version="1.0" encoding="utf-8"?>
+<ds:datastoreItem xmlns:ds="http://schemas.openxmlformats.org/officeDocument/2006/customXml" ds:itemID="{878A3276-187E-405F-966A-BDA24FF7DCFF}">
   <ds:schemaRefs>
-    <ds:schemaRef ds:uri="http://schemas.microsoft.com/office/2006/metadata/properties"/>
-    <ds:schemaRef ds:uri="http://schemas.microsoft.com/office/infopath/2007/PartnerControls"/>
-    <ds:schemaRef ds:uri="http://schemas.microsoft.com/sharepoint/v3"/>
-    <ds:schemaRef ds:uri="71af3243-3dd4-4a8d-8c0d-dd76da1f02a5"/>
-    <ds:schemaRef ds:uri="230e9df3-be65-4c73-a93b-d1236ebd677e"/>
-  </ds:schemaRefs>
-</ds:datastoreItem>
-</file>
-
-<file path=customXml/itemProps4.xml><?xml version="1.0" encoding="utf-8"?>
-<ds:datastoreItem xmlns:ds="http://schemas.openxmlformats.org/officeDocument/2006/customXml" ds:itemID="{9EAA2E9E-4E47-497B-A79A-B397382D8E2F}">
-  <ds:schemaRefs>
-    <ds:schemaRef ds:uri="http://schemas.openxmlformats.org/officeDocument/2006/bibliography"/>
+    <ds:schemaRef ds:uri="http://schemas.microsoft.com/sharepoint/v3/contenttype/forms"/>
   </ds:schemaRefs>
 </ds:datastoreItem>
 </file>
</xml_diff>